<commit_message>
fix(ai-engineer): add light telephony/LLM diversity/CRM signals to v2 opencall
- AI/LLM skills: append LLaMA, Gemini, Mistral (light LLM diversity signal)
- Backend & APIs skills: append Twilio (telephony familiarity)
- Career Automation bullet 1: label Apollo.io as CRM integration, add appointment
  coordination — honest framing of existing agent tasks, not oversold

https://claude.ai/code/session_01RmQWkNHacm2jL6vSStdVfA
</commit_message>
<xml_diff>
--- a/profiles/ai-engineer/Shreyas_Khandare_AI_Engineer_v2_opencall.docx
+++ b/profiles/ai-engineer/Shreyas_Khandare_AI_Engineer_v2_opencall.docx
@@ -207,7 +207,7 @@
           <w:sz w:val="20"/>
           <w:szCs w:val="20"/>
         </w:rPr>
-        <w:t xml:space="preserve">LangChain, LangGraph, RAG, Multi-Agent Orchestration, ChromaDB, BM25 Hybrid Retrieval, Cohere Rerank, RAGAS, Prompt Engineering, GPT-4o-mini, Claude API, OpenAI API</w:t>
+        <w:t>LangChain, LangGraph, RAG, Multi-Agent Orchestration, ChromaDB, BM25 Hybrid Retrieval, Cohere Rerank, RAGAS, Prompt Engineering, GPT-4o-mini, Claude API, OpenAI API, LLaMA, Gemini, Mistral</w:t>
       </w:r>
     </w:p>
     <w:p>
@@ -232,7 +232,7 @@
           <w:sz w:val="20"/>
           <w:szCs w:val="20"/>
         </w:rPr>
-        <w:t xml:space="preserve">Python, FastAPI, Node.js, C#, ASP.NET, RESTful APIs, Django REST Framework</w:t>
+        <w:t>Python, FastAPI, Node.js, C#, ASP.NET, RESTful APIs, Django REST Framework, Twilio</w:t>
       </w:r>
     </w:p>
     <w:p>
@@ -493,7 +493,7 @@
           <w:sz w:val="20"/>
           <w:szCs w:val="20"/>
         </w:rPr>
-        <w:t>Designed and deployed an 8-agent automation platform for real-world tasks: job discovery, lead qualification, email triage, resume tailoring, and AI market intelligence — fully async, config-driven, zero daily manual time</w:t>
+        <w:t>Designed and deployed an 8-agent automation platform for real-world tasks: job discovery, lead qualification, CRM integration (Apollo.io), appointment coordination, email triage, and AI market intelligence — fully async, config-driven, zero daily manual time</w:t>
       </w:r>
     </w:p>
     <w:p>

</xml_diff>